<commit_message>
Write conclusions based on the completed work
</commit_message>
<xml_diff>
--- a/LAB2/DevOps_2.docx
+++ b/LAB2/DevOps_2.docx
@@ -1904,7 +1904,6 @@
           <w:sz w:val="28"/>
           <w:szCs w:val="28"/>
         </w:rPr>
-        <w:lastRenderedPageBreak/>
         <w:drawing>
           <wp:inline distT="0" distB="0" distL="0" distR="0" wp14:anchorId="0D81A407" wp14:editId="417E64F4">
             <wp:extent cx="5744377" cy="1543265"/>
@@ -2295,7 +2294,6 @@
           <w:sz w:val="28"/>
           <w:szCs w:val="28"/>
         </w:rPr>
-        <w:lastRenderedPageBreak/>
         <w:drawing>
           <wp:inline distT="0" distB="0" distL="0" distR="0" wp14:anchorId="4DFAB906" wp14:editId="2282B19F">
             <wp:extent cx="5940425" cy="5568950"/>
@@ -2550,7 +2548,6 @@
         <w:rPr>
           <w:noProof/>
         </w:rPr>
-        <w:lastRenderedPageBreak/>
         <w:drawing>
           <wp:inline distT="0" distB="0" distL="0" distR="0" wp14:anchorId="0CB8B6EA" wp14:editId="254DF49F">
             <wp:extent cx="4838095" cy="1409524"/>
@@ -2984,7 +2981,6 @@
           <w:sz w:val="28"/>
           <w:szCs w:val="28"/>
         </w:rPr>
-        <w:lastRenderedPageBreak/>
         <w:drawing>
           <wp:inline distT="0" distB="0" distL="0" distR="0" wp14:anchorId="4C7E23D3" wp14:editId="1E312FCB">
             <wp:extent cx="5611008" cy="323895"/>
@@ -3655,7 +3651,6 @@
           <w:sz w:val="28"/>
           <w:szCs w:val="28"/>
         </w:rPr>
-        <w:lastRenderedPageBreak/>
         <w:drawing>
           <wp:inline distT="0" distB="0" distL="0" distR="0" wp14:anchorId="2F8426B5" wp14:editId="10359503">
             <wp:extent cx="4705350" cy="1663848"/>
@@ -3869,7 +3864,6 @@
           <w:sz w:val="28"/>
           <w:szCs w:val="28"/>
         </w:rPr>
-        <w:lastRenderedPageBreak/>
         <w:drawing>
           <wp:inline distT="0" distB="0" distL="0" distR="0" wp14:anchorId="3A93BEDF" wp14:editId="23EA0B88">
             <wp:extent cx="4972050" cy="3761857"/>
@@ -4024,7 +4018,6 @@
           <w:sz w:val="28"/>
           <w:szCs w:val="28"/>
         </w:rPr>
-        <w:lastRenderedPageBreak/>
         <w:drawing>
           <wp:inline distT="0" distB="0" distL="0" distR="0" wp14:anchorId="4F0A414A" wp14:editId="57779570">
             <wp:extent cx="5372850" cy="1971950"/>
@@ -4197,7 +4190,6 @@
           <w:rFonts w:ascii="Times New Roman" w:hAnsi="Times New Roman" w:cs="Times New Roman"/>
           <w:sz w:val="28"/>
           <w:szCs w:val="28"/>
-          <w:lang w:val="en-US"/>
         </w:rPr>
       </w:pPr>
     </w:p>
@@ -4230,6 +4222,7 @@
           <w:rFonts w:ascii="Consolas" w:hAnsi="Consolas" w:cs="Times New Roman"/>
           <w:sz w:val="20"/>
           <w:szCs w:val="20"/>
+          <w:lang w:val="en-US"/>
         </w:rPr>
       </w:pPr>
     </w:p>
@@ -4241,13 +4234,15 @@
           <w:rFonts w:ascii="Consolas" w:hAnsi="Consolas" w:cs="Times New Roman"/>
           <w:sz w:val="20"/>
           <w:szCs w:val="20"/>
-        </w:rPr>
-      </w:pPr>
-      <w:r>
-        <w:rPr>
-          <w:rFonts w:ascii="Consolas" w:hAnsi="Consolas" w:cs="Times New Roman"/>
-          <w:sz w:val="20"/>
-          <w:szCs w:val="20"/>
+          <w:lang w:val="en-US"/>
+        </w:rPr>
+      </w:pPr>
+      <w:r>
+        <w:rPr>
+          <w:rFonts w:ascii="Consolas" w:hAnsi="Consolas" w:cs="Times New Roman"/>
+          <w:sz w:val="20"/>
+          <w:szCs w:val="20"/>
+          <w:lang w:val="en-US"/>
         </w:rPr>
         <w:t xml:space="preserve">python3 -m </w:t>
       </w:r>
@@ -4257,6 +4252,7 @@
           <w:rFonts w:ascii="Consolas" w:hAnsi="Consolas" w:cs="Times New Roman"/>
           <w:sz w:val="20"/>
           <w:szCs w:val="20"/>
+          <w:lang w:val="en-US"/>
         </w:rPr>
         <w:t>venv</w:t>
       </w:r>
@@ -4266,6 +4262,136 @@
           <w:rFonts w:ascii="Consolas" w:hAnsi="Consolas" w:cs="Times New Roman"/>
           <w:sz w:val="20"/>
           <w:szCs w:val="20"/>
+          <w:lang w:val="en-US"/>
+        </w:rPr>
+        <w:t xml:space="preserve"> env</w:t>
+      </w:r>
+    </w:p>
+    <w:p>
+      <w:pPr>
+        <w:spacing w:after="0" w:line="240" w:lineRule="auto"/>
+        <w:jc w:val="both"/>
+        <w:rPr>
+          <w:rFonts w:ascii="Consolas" w:hAnsi="Consolas" w:cs="Times New Roman"/>
+          <w:sz w:val="20"/>
+          <w:szCs w:val="20"/>
+          <w:lang w:val="en-US"/>
+        </w:rPr>
+      </w:pPr>
+      <w:r>
+        <w:rPr>
+          <w:rFonts w:ascii="Consolas" w:hAnsi="Consolas" w:cs="Times New Roman"/>
+          <w:sz w:val="20"/>
+          <w:szCs w:val="20"/>
+          <w:lang w:val="en-US"/>
+        </w:rPr>
+        <w:t>. env/bin/activate</w:t>
+      </w:r>
+    </w:p>
+    <w:p>
+      <w:pPr>
+        <w:spacing w:after="0" w:line="240" w:lineRule="auto"/>
+        <w:jc w:val="both"/>
+        <w:rPr>
+          <w:rFonts w:ascii="Consolas" w:hAnsi="Consolas" w:cs="Times New Roman"/>
+          <w:sz w:val="20"/>
+          <w:szCs w:val="20"/>
+          <w:lang w:val="en-US"/>
+        </w:rPr>
+      </w:pPr>
+    </w:p>
+    <w:p>
+      <w:pPr>
+        <w:spacing w:after="0" w:line="240" w:lineRule="auto"/>
+        <w:jc w:val="both"/>
+        <w:rPr>
+          <w:rFonts w:ascii="Consolas" w:hAnsi="Consolas" w:cs="Times New Roman"/>
+          <w:sz w:val="20"/>
+          <w:szCs w:val="20"/>
+          <w:lang w:val="en-US"/>
+        </w:rPr>
+      </w:pPr>
+      <w:r>
+        <w:rPr>
+          <w:rFonts w:ascii="Consolas" w:hAnsi="Consolas" w:cs="Times New Roman"/>
+          <w:sz w:val="20"/>
+          <w:szCs w:val="20"/>
+          <w:lang w:val="en-US"/>
+        </w:rPr>
+        <w:t xml:space="preserve">pip install </w:t>
+      </w:r>
+      <w:proofErr w:type="spellStart"/>
+      <w:r>
+        <w:rPr>
+          <w:rFonts w:ascii="Consolas" w:hAnsi="Consolas" w:cs="Times New Roman"/>
+          <w:sz w:val="20"/>
+          <w:szCs w:val="20"/>
+          <w:lang w:val="en-US"/>
+        </w:rPr>
+        <w:t>django</w:t>
+      </w:r>
+      <w:proofErr w:type="spellEnd"/>
+    </w:p>
+    <w:p>
+      <w:pPr>
+        <w:spacing w:after="0" w:line="240" w:lineRule="auto"/>
+        <w:jc w:val="both"/>
+        <w:rPr>
+          <w:rFonts w:ascii="Consolas" w:hAnsi="Consolas" w:cs="Times New Roman"/>
+          <w:sz w:val="20"/>
+          <w:szCs w:val="20"/>
+          <w:lang w:val="en-US"/>
+        </w:rPr>
+      </w:pPr>
+    </w:p>
+    <w:p>
+      <w:pPr>
+        <w:spacing w:after="0" w:line="240" w:lineRule="auto"/>
+        <w:jc w:val="both"/>
+        <w:rPr>
+          <w:rFonts w:ascii="Consolas" w:hAnsi="Consolas" w:cs="Times New Roman"/>
+          <w:sz w:val="20"/>
+          <w:szCs w:val="20"/>
+          <w:lang w:val="en-US"/>
+        </w:rPr>
+      </w:pPr>
+      <w:proofErr w:type="spellStart"/>
+      <w:r>
+        <w:rPr>
+          <w:rFonts w:ascii="Consolas" w:hAnsi="Consolas" w:cs="Times New Roman"/>
+          <w:sz w:val="20"/>
+          <w:szCs w:val="20"/>
+          <w:lang w:val="en-US"/>
+        </w:rPr>
+        <w:t>django</w:t>
+      </w:r>
+      <w:proofErr w:type="spellEnd"/>
+      <w:r>
+        <w:rPr>
+          <w:rFonts w:ascii="Consolas" w:hAnsi="Consolas" w:cs="Times New Roman"/>
+          <w:sz w:val="20"/>
+          <w:szCs w:val="20"/>
+          <w:lang w:val="en-US"/>
+        </w:rPr>
+        <w:t xml:space="preserve">-admin </w:t>
+      </w:r>
+      <w:proofErr w:type="spellStart"/>
+      <w:r>
+        <w:rPr>
+          <w:rFonts w:ascii="Consolas" w:hAnsi="Consolas" w:cs="Times New Roman"/>
+          <w:sz w:val="20"/>
+          <w:szCs w:val="20"/>
+          <w:lang w:val="en-US"/>
+        </w:rPr>
+        <w:t>startproject</w:t>
+      </w:r>
+      <w:proofErr w:type="spellEnd"/>
+      <w:r>
+        <w:rPr>
+          <w:rFonts w:ascii="Consolas" w:hAnsi="Consolas" w:cs="Times New Roman"/>
+          <w:sz w:val="20"/>
+          <w:szCs w:val="20"/>
+          <w:lang w:val="en-US"/>
         </w:rPr>
         <w:t xml:space="preserve"> </w:t>
       </w:r>
@@ -4275,8 +4401,9 @@
           <w:rFonts w:ascii="Consolas" w:hAnsi="Consolas" w:cs="Times New Roman"/>
           <w:sz w:val="20"/>
           <w:szCs w:val="20"/>
-        </w:rPr>
-        <w:t>env</w:t>
+          <w:lang w:val="en-US"/>
+        </w:rPr>
+        <w:t>proj</w:t>
       </w:r>
       <w:proofErr w:type="spellEnd"/>
     </w:p>
@@ -4298,8 +4425,19 @@
           <w:szCs w:val="20"/>
           <w:lang w:val="en-US"/>
         </w:rPr>
-        <w:t>. env/bin/activate</w:t>
-      </w:r>
+        <w:t xml:space="preserve">cd </w:t>
+      </w:r>
+      <w:proofErr w:type="spellStart"/>
+      <w:r>
+        <w:rPr>
+          <w:rFonts w:ascii="Consolas" w:hAnsi="Consolas" w:cs="Times New Roman"/>
+          <w:sz w:val="20"/>
+          <w:szCs w:val="20"/>
+          <w:lang w:val="en-US"/>
+        </w:rPr>
+        <w:t>proj</w:t>
+      </w:r>
+      <w:proofErr w:type="spellEnd"/>
     </w:p>
     <w:p>
       <w:pPr>
@@ -4312,6 +4450,46 @@
           <w:lang w:val="en-US"/>
         </w:rPr>
       </w:pPr>
+      <w:r>
+        <w:rPr>
+          <w:rFonts w:ascii="Consolas" w:hAnsi="Consolas" w:cs="Times New Roman"/>
+          <w:sz w:val="20"/>
+          <w:szCs w:val="20"/>
+          <w:lang w:val="en-US"/>
+        </w:rPr>
+        <w:t xml:space="preserve">python manage.py </w:t>
+      </w:r>
+      <w:proofErr w:type="spellStart"/>
+      <w:r>
+        <w:rPr>
+          <w:rFonts w:ascii="Consolas" w:hAnsi="Consolas" w:cs="Times New Roman"/>
+          <w:sz w:val="20"/>
+          <w:szCs w:val="20"/>
+          <w:lang w:val="en-US"/>
+        </w:rPr>
+        <w:t>startapp</w:t>
+      </w:r>
+      <w:proofErr w:type="spellEnd"/>
+      <w:r>
+        <w:rPr>
+          <w:rFonts w:ascii="Consolas" w:hAnsi="Consolas" w:cs="Times New Roman"/>
+          <w:sz w:val="20"/>
+          <w:szCs w:val="20"/>
+          <w:lang w:val="en-US"/>
+        </w:rPr>
+        <w:t xml:space="preserve"> </w:t>
+      </w:r>
+      <w:proofErr w:type="spellStart"/>
+      <w:r>
+        <w:rPr>
+          <w:rFonts w:ascii="Consolas" w:hAnsi="Consolas" w:cs="Times New Roman"/>
+          <w:sz w:val="20"/>
+          <w:szCs w:val="20"/>
+          <w:lang w:val="en-US"/>
+        </w:rPr>
+        <w:t>myapp</w:t>
+      </w:r>
+      <w:proofErr w:type="spellEnd"/>
     </w:p>
     <w:p>
       <w:pPr>
@@ -4324,26 +4502,6 @@
           <w:lang w:val="en-US"/>
         </w:rPr>
       </w:pPr>
-      <w:r>
-        <w:rPr>
-          <w:rFonts w:ascii="Consolas" w:hAnsi="Consolas" w:cs="Times New Roman"/>
-          <w:sz w:val="20"/>
-          <w:szCs w:val="20"/>
-          <w:lang w:val="en-US"/>
-        </w:rPr>
-        <w:t xml:space="preserve">pip install </w:t>
-      </w:r>
-      <w:proofErr w:type="spellStart"/>
-      <w:r>
-        <w:rPr>
-          <w:rFonts w:ascii="Consolas" w:hAnsi="Consolas" w:cs="Times New Roman"/>
-          <w:sz w:val="20"/>
-          <w:szCs w:val="20"/>
-          <w:lang w:val="en-US"/>
-        </w:rPr>
-        <w:t>django</w:t>
-      </w:r>
-      <w:proofErr w:type="spellEnd"/>
     </w:p>
     <w:p>
       <w:pPr>
@@ -4356,6 +4514,32 @@
           <w:lang w:val="en-US"/>
         </w:rPr>
       </w:pPr>
+      <w:r>
+        <w:rPr>
+          <w:rFonts w:ascii="Consolas" w:hAnsi="Consolas" w:cs="Times New Roman"/>
+          <w:sz w:val="20"/>
+          <w:szCs w:val="20"/>
+          <w:lang w:val="en-US"/>
+        </w:rPr>
+        <w:t xml:space="preserve"># </w:t>
+      </w:r>
+      <w:r>
+        <w:rPr>
+          <w:rFonts w:ascii="Consolas" w:hAnsi="Consolas" w:cs="Times New Roman"/>
+          <w:sz w:val="20"/>
+          <w:szCs w:val="20"/>
+        </w:rPr>
+        <w:t>настроить</w:t>
+      </w:r>
+      <w:r>
+        <w:rPr>
+          <w:rFonts w:ascii="Consolas" w:hAnsi="Consolas" w:cs="Times New Roman"/>
+          <w:sz w:val="20"/>
+          <w:szCs w:val="20"/>
+          <w:lang w:val="en-US"/>
+        </w:rPr>
+        <w:t xml:space="preserve"> settings.py</w:t>
+      </w:r>
     </w:p>
     <w:p>
       <w:pPr>
@@ -4368,57 +4552,6 @@
           <w:lang w:val="en-US"/>
         </w:rPr>
       </w:pPr>
-      <w:proofErr w:type="spellStart"/>
-      <w:r>
-        <w:rPr>
-          <w:rFonts w:ascii="Consolas" w:hAnsi="Consolas" w:cs="Times New Roman"/>
-          <w:sz w:val="20"/>
-          <w:szCs w:val="20"/>
-          <w:lang w:val="en-US"/>
-        </w:rPr>
-        <w:t>django</w:t>
-      </w:r>
-      <w:proofErr w:type="spellEnd"/>
-      <w:r>
-        <w:rPr>
-          <w:rFonts w:ascii="Consolas" w:hAnsi="Consolas" w:cs="Times New Roman"/>
-          <w:sz w:val="20"/>
-          <w:szCs w:val="20"/>
-          <w:lang w:val="en-US"/>
-        </w:rPr>
-        <w:t xml:space="preserve">-admin </w:t>
-      </w:r>
-      <w:proofErr w:type="spellStart"/>
-      <w:r>
-        <w:rPr>
-          <w:rFonts w:ascii="Consolas" w:hAnsi="Consolas" w:cs="Times New Roman"/>
-          <w:sz w:val="20"/>
-          <w:szCs w:val="20"/>
-          <w:lang w:val="en-US"/>
-        </w:rPr>
-        <w:t>startproject</w:t>
-      </w:r>
-      <w:proofErr w:type="spellEnd"/>
-      <w:r>
-        <w:rPr>
-          <w:rFonts w:ascii="Consolas" w:hAnsi="Consolas" w:cs="Times New Roman"/>
-          <w:sz w:val="20"/>
-          <w:szCs w:val="20"/>
-          <w:lang w:val="en-US"/>
-        </w:rPr>
-        <w:t xml:space="preserve"> </w:t>
-      </w:r>
-      <w:proofErr w:type="spellStart"/>
-      <w:r>
-        <w:rPr>
-          <w:rFonts w:ascii="Consolas" w:hAnsi="Consolas" w:cs="Times New Roman"/>
-          <w:sz w:val="20"/>
-          <w:szCs w:val="20"/>
-          <w:lang w:val="en-US"/>
-        </w:rPr>
-        <w:t>proj</w:t>
-      </w:r>
-      <w:proofErr w:type="spellEnd"/>
     </w:p>
     <w:p>
       <w:pPr>
@@ -4438,172 +4571,8 @@
           <w:szCs w:val="20"/>
           <w:lang w:val="en-US"/>
         </w:rPr>
-        <w:t xml:space="preserve">cd </w:t>
-      </w:r>
-      <w:proofErr w:type="spellStart"/>
-      <w:r>
-        <w:rPr>
-          <w:rFonts w:ascii="Consolas" w:hAnsi="Consolas" w:cs="Times New Roman"/>
-          <w:sz w:val="20"/>
-          <w:szCs w:val="20"/>
-          <w:lang w:val="en-US"/>
-        </w:rPr>
-        <w:t>proj</w:t>
-      </w:r>
-      <w:proofErr w:type="spellEnd"/>
-    </w:p>
-    <w:p>
-      <w:pPr>
-        <w:spacing w:after="0" w:line="240" w:lineRule="auto"/>
-        <w:jc w:val="both"/>
-        <w:rPr>
-          <w:rFonts w:ascii="Consolas" w:hAnsi="Consolas" w:cs="Times New Roman"/>
-          <w:sz w:val="20"/>
-          <w:szCs w:val="20"/>
-          <w:lang w:val="en-US"/>
-        </w:rPr>
-      </w:pPr>
-      <w:r>
-        <w:rPr>
-          <w:rFonts w:ascii="Consolas" w:hAnsi="Consolas" w:cs="Times New Roman"/>
-          <w:sz w:val="20"/>
-          <w:szCs w:val="20"/>
-          <w:lang w:val="en-US"/>
-        </w:rPr>
-        <w:t xml:space="preserve">python manage.py </w:t>
-      </w:r>
-      <w:proofErr w:type="spellStart"/>
-      <w:r>
-        <w:rPr>
-          <w:rFonts w:ascii="Consolas" w:hAnsi="Consolas" w:cs="Times New Roman"/>
-          <w:sz w:val="20"/>
-          <w:szCs w:val="20"/>
-          <w:lang w:val="en-US"/>
-        </w:rPr>
-        <w:t>startapp</w:t>
-      </w:r>
-      <w:proofErr w:type="spellEnd"/>
-      <w:r>
-        <w:rPr>
-          <w:rFonts w:ascii="Consolas" w:hAnsi="Consolas" w:cs="Times New Roman"/>
-          <w:sz w:val="20"/>
-          <w:szCs w:val="20"/>
-          <w:lang w:val="en-US"/>
-        </w:rPr>
-        <w:t xml:space="preserve"> </w:t>
-      </w:r>
-      <w:proofErr w:type="spellStart"/>
-      <w:r>
-        <w:rPr>
-          <w:rFonts w:ascii="Consolas" w:hAnsi="Consolas" w:cs="Times New Roman"/>
-          <w:sz w:val="20"/>
-          <w:szCs w:val="20"/>
-          <w:lang w:val="en-US"/>
-        </w:rPr>
-        <w:t>myapp</w:t>
-      </w:r>
-      <w:proofErr w:type="spellEnd"/>
-    </w:p>
-    <w:p>
-      <w:pPr>
-        <w:spacing w:after="0" w:line="240" w:lineRule="auto"/>
-        <w:jc w:val="both"/>
-        <w:rPr>
-          <w:rFonts w:ascii="Consolas" w:hAnsi="Consolas" w:cs="Times New Roman"/>
-          <w:sz w:val="20"/>
-          <w:szCs w:val="20"/>
-          <w:lang w:val="en-US"/>
-        </w:rPr>
-      </w:pPr>
-    </w:p>
-    <w:p>
-      <w:pPr>
-        <w:spacing w:after="0" w:line="240" w:lineRule="auto"/>
-        <w:jc w:val="both"/>
-        <w:rPr>
-          <w:rFonts w:ascii="Consolas" w:hAnsi="Consolas" w:cs="Times New Roman"/>
-          <w:sz w:val="20"/>
-          <w:szCs w:val="20"/>
-          <w:lang w:val="en-US"/>
-        </w:rPr>
-      </w:pPr>
-      <w:r>
-        <w:rPr>
-          <w:rFonts w:ascii="Consolas" w:hAnsi="Consolas" w:cs="Times New Roman"/>
-          <w:sz w:val="20"/>
-          <w:szCs w:val="20"/>
-          <w:lang w:val="en-US"/>
-        </w:rPr>
-        <w:t xml:space="preserve"># </w:t>
-      </w:r>
-      <w:r>
-        <w:rPr>
-          <w:rFonts w:ascii="Consolas" w:hAnsi="Consolas" w:cs="Times New Roman"/>
-          <w:sz w:val="20"/>
-          <w:szCs w:val="20"/>
-        </w:rPr>
-        <w:t>настроить</w:t>
-      </w:r>
-      <w:r>
-        <w:rPr>
-          <w:rFonts w:ascii="Consolas" w:hAnsi="Consolas" w:cs="Times New Roman"/>
-          <w:sz w:val="20"/>
-          <w:szCs w:val="20"/>
-          <w:lang w:val="en-US"/>
-        </w:rPr>
-        <w:t xml:space="preserve"> settings.py</w:t>
-      </w:r>
-    </w:p>
-    <w:p>
-      <w:pPr>
-        <w:spacing w:after="0" w:line="240" w:lineRule="auto"/>
-        <w:jc w:val="both"/>
-        <w:rPr>
-          <w:rFonts w:ascii="Consolas" w:hAnsi="Consolas" w:cs="Times New Roman"/>
-          <w:sz w:val="20"/>
-          <w:szCs w:val="20"/>
-          <w:lang w:val="en-US"/>
-        </w:rPr>
-      </w:pPr>
-    </w:p>
-    <w:p>
-      <w:pPr>
-        <w:spacing w:after="0" w:line="240" w:lineRule="auto"/>
-        <w:jc w:val="both"/>
-        <w:rPr>
-          <w:rFonts w:ascii="Consolas" w:hAnsi="Consolas" w:cs="Times New Roman"/>
-          <w:sz w:val="20"/>
-          <w:szCs w:val="20"/>
-        </w:rPr>
-      </w:pPr>
-      <w:proofErr w:type="spellStart"/>
-      <w:r>
-        <w:rPr>
-          <w:rFonts w:ascii="Consolas" w:hAnsi="Consolas" w:cs="Times New Roman"/>
-          <w:sz w:val="20"/>
-          <w:szCs w:val="20"/>
-        </w:rPr>
-        <w:t>python</w:t>
-      </w:r>
-      <w:proofErr w:type="spellEnd"/>
-      <w:r>
-        <w:rPr>
-          <w:rFonts w:ascii="Consolas" w:hAnsi="Consolas" w:cs="Times New Roman"/>
-          <w:sz w:val="20"/>
-          <w:szCs w:val="20"/>
-        </w:rPr>
-        <w:t xml:space="preserve"> manage.py </w:t>
-      </w:r>
-      <w:proofErr w:type="spellStart"/>
-      <w:r>
-        <w:rPr>
-          <w:rFonts w:ascii="Consolas" w:hAnsi="Consolas" w:cs="Times New Roman"/>
-          <w:sz w:val="20"/>
-          <w:szCs w:val="20"/>
-        </w:rPr>
-        <w:t>migrate</w:t>
-      </w:r>
-      <w:proofErr w:type="spellEnd"/>
+        <w:t>python manage.py migrate</w:t>
+      </w:r>
     </w:p>
     <w:p>
       <w:pPr>
@@ -4988,17 +4957,60 @@
           <w:rFonts w:ascii="Consolas" w:hAnsi="Consolas" w:cs="Times New Roman"/>
           <w:sz w:val="20"/>
           <w:szCs w:val="20"/>
-          <w:lang w:val="en-US"/>
-        </w:rPr>
-      </w:pPr>
-      <w:r>
-        <w:rPr>
-          <w:rFonts w:ascii="Consolas" w:hAnsi="Consolas" w:cs="Times New Roman"/>
-          <w:sz w:val="20"/>
-          <w:szCs w:val="20"/>
-          <w:lang w:val="en-US"/>
-        </w:rPr>
-        <w:t xml:space="preserve">python manage.py </w:t>
+        </w:rPr>
+      </w:pPr>
+      <w:r>
+        <w:rPr>
+          <w:rFonts w:ascii="Consolas" w:hAnsi="Consolas" w:cs="Times New Roman"/>
+          <w:sz w:val="20"/>
+          <w:szCs w:val="20"/>
+          <w:lang w:val="en-US"/>
+        </w:rPr>
+        <w:t>python</w:t>
+      </w:r>
+      <w:r>
+        <w:rPr>
+          <w:rFonts w:ascii="Consolas" w:hAnsi="Consolas" w:cs="Times New Roman"/>
+          <w:sz w:val="20"/>
+          <w:szCs w:val="20"/>
+        </w:rPr>
+        <w:t xml:space="preserve"> </w:t>
+      </w:r>
+      <w:r>
+        <w:rPr>
+          <w:rFonts w:ascii="Consolas" w:hAnsi="Consolas" w:cs="Times New Roman"/>
+          <w:sz w:val="20"/>
+          <w:szCs w:val="20"/>
+          <w:lang w:val="en-US"/>
+        </w:rPr>
+        <w:t>manage</w:t>
+      </w:r>
+      <w:r>
+        <w:rPr>
+          <w:rFonts w:ascii="Consolas" w:hAnsi="Consolas" w:cs="Times New Roman"/>
+          <w:sz w:val="20"/>
+          <w:szCs w:val="20"/>
+        </w:rPr>
+        <w:t>.</w:t>
+      </w:r>
+      <w:proofErr w:type="spellStart"/>
+      <w:r>
+        <w:rPr>
+          <w:rFonts w:ascii="Consolas" w:hAnsi="Consolas" w:cs="Times New Roman"/>
+          <w:sz w:val="20"/>
+          <w:szCs w:val="20"/>
+          <w:lang w:val="en-US"/>
+        </w:rPr>
+        <w:t>py</w:t>
+      </w:r>
+      <w:proofErr w:type="spellEnd"/>
+      <w:r>
+        <w:rPr>
+          <w:rFonts w:ascii="Consolas" w:hAnsi="Consolas" w:cs="Times New Roman"/>
+          <w:sz w:val="20"/>
+          <w:szCs w:val="20"/>
+        </w:rPr>
+        <w:t xml:space="preserve"> </w:t>
       </w:r>
       <w:r>
         <w:rPr>
@@ -5047,6 +5059,510 @@
           <w:szCs w:val="28"/>
         </w:rPr>
       </w:pPr>
+    </w:p>
+    <w:p>
+      <w:pPr>
+        <w:spacing w:after="0" w:line="276" w:lineRule="auto"/>
+        <w:ind w:firstLine="709"/>
+        <w:jc w:val="both"/>
+        <w:rPr>
+          <w:rFonts w:ascii="Times New Roman" w:hAnsi="Times New Roman" w:cs="Times New Roman"/>
+          <w:sz w:val="28"/>
+          <w:szCs w:val="28"/>
+        </w:rPr>
+      </w:pPr>
+    </w:p>
+    <w:p>
+      <w:pPr>
+        <w:spacing w:after="0" w:line="276" w:lineRule="auto"/>
+        <w:ind w:firstLine="709"/>
+        <w:jc w:val="both"/>
+        <w:rPr>
+          <w:rFonts w:ascii="Times New Roman" w:hAnsi="Times New Roman" w:cs="Times New Roman"/>
+          <w:b/>
+          <w:bCs/>
+          <w:sz w:val="28"/>
+          <w:szCs w:val="28"/>
+        </w:rPr>
+      </w:pPr>
+      <w:r>
+        <w:rPr>
+          <w:rFonts w:ascii="Times New Roman" w:hAnsi="Times New Roman" w:cs="Times New Roman"/>
+          <w:b/>
+          <w:bCs/>
+          <w:sz w:val="28"/>
+          <w:szCs w:val="28"/>
+        </w:rPr>
+        <w:t>Выводы:</w:t>
+      </w:r>
+    </w:p>
+    <w:p>
+      <w:pPr>
+        <w:spacing w:after="0" w:line="276" w:lineRule="auto"/>
+        <w:ind w:firstLine="709"/>
+        <w:jc w:val="both"/>
+        <w:rPr>
+          <w:rFonts w:ascii="Times New Roman" w:hAnsi="Times New Roman" w:cs="Times New Roman"/>
+          <w:sz w:val="28"/>
+          <w:szCs w:val="28"/>
+        </w:rPr>
+      </w:pPr>
+      <w:r>
+        <w:rPr>
+          <w:rFonts w:ascii="Times New Roman" w:hAnsi="Times New Roman" w:cs="Times New Roman"/>
+          <w:sz w:val="28"/>
+          <w:szCs w:val="28"/>
+        </w:rPr>
+        <w:t>В ходе выполнения работы:</w:t>
+      </w:r>
+    </w:p>
+    <w:p>
+      <w:pPr>
+        <w:pStyle w:val="a3"/>
+        <w:numPr>
+          <w:ilvl w:val="0"/>
+          <w:numId w:val="5"/>
+        </w:numPr>
+        <w:tabs>
+          <w:tab w:val="left" w:pos="993"/>
+        </w:tabs>
+        <w:spacing w:after="0" w:line="276" w:lineRule="auto"/>
+        <w:ind w:left="0" w:firstLine="709"/>
+        <w:jc w:val="both"/>
+        <w:rPr>
+          <w:rFonts w:ascii="Times New Roman" w:hAnsi="Times New Roman" w:cs="Times New Roman"/>
+          <w:sz w:val="28"/>
+          <w:szCs w:val="28"/>
+        </w:rPr>
+      </w:pPr>
+      <w:r>
+        <w:rPr>
+          <w:rFonts w:ascii="Times New Roman" w:hAnsi="Times New Roman" w:cs="Times New Roman"/>
+          <w:sz w:val="28"/>
+          <w:szCs w:val="28"/>
+        </w:rPr>
+        <w:t xml:space="preserve">Была установлена и настроена СУБД </w:t>
+      </w:r>
+      <w:proofErr w:type="spellStart"/>
+      <w:r>
+        <w:rPr>
+          <w:rFonts w:ascii="Times New Roman" w:hAnsi="Times New Roman" w:cs="Times New Roman"/>
+          <w:sz w:val="28"/>
+          <w:szCs w:val="28"/>
+        </w:rPr>
+        <w:t>PostgreSQL</w:t>
+      </w:r>
+      <w:proofErr w:type="spellEnd"/>
+      <w:r>
+        <w:rPr>
+          <w:rFonts w:ascii="Times New Roman" w:hAnsi="Times New Roman" w:cs="Times New Roman"/>
+          <w:sz w:val="28"/>
+          <w:szCs w:val="28"/>
+        </w:rPr>
+        <w:t xml:space="preserve"> 17, создан пользователь </w:t>
+      </w:r>
+      <w:proofErr w:type="spellStart"/>
+      <w:r>
+        <w:rPr>
+          <w:rFonts w:ascii="Times New Roman" w:hAnsi="Times New Roman" w:cs="Times New Roman"/>
+          <w:sz w:val="28"/>
+          <w:szCs w:val="28"/>
+        </w:rPr>
+        <w:t>gasuser</w:t>
+      </w:r>
+      <w:proofErr w:type="spellEnd"/>
+      <w:r>
+        <w:rPr>
+          <w:rFonts w:ascii="Times New Roman" w:hAnsi="Times New Roman" w:cs="Times New Roman"/>
+          <w:sz w:val="28"/>
+          <w:szCs w:val="28"/>
+        </w:rPr>
+        <w:t xml:space="preserve"> и база данных </w:t>
+      </w:r>
+      <w:proofErr w:type="spellStart"/>
+      <w:r>
+        <w:rPr>
+          <w:rFonts w:ascii="Times New Roman" w:hAnsi="Times New Roman" w:cs="Times New Roman"/>
+          <w:sz w:val="28"/>
+          <w:szCs w:val="28"/>
+        </w:rPr>
+        <w:t>gasdb</w:t>
+      </w:r>
+      <w:proofErr w:type="spellEnd"/>
+      <w:r>
+        <w:rPr>
+          <w:rFonts w:ascii="Times New Roman" w:hAnsi="Times New Roman" w:cs="Times New Roman"/>
+          <w:sz w:val="28"/>
+          <w:szCs w:val="28"/>
+        </w:rPr>
+        <w:t xml:space="preserve">, настроена аутентификация в </w:t>
+      </w:r>
+      <w:proofErr w:type="spellStart"/>
+      <w:r>
+        <w:rPr>
+          <w:rFonts w:ascii="Times New Roman" w:hAnsi="Times New Roman" w:cs="Times New Roman"/>
+          <w:sz w:val="28"/>
+          <w:szCs w:val="28"/>
+        </w:rPr>
+        <w:t>pg_hba.conf</w:t>
+      </w:r>
+      <w:proofErr w:type="spellEnd"/>
+      <w:r>
+        <w:rPr>
+          <w:rFonts w:ascii="Times New Roman" w:hAnsi="Times New Roman" w:cs="Times New Roman"/>
+          <w:sz w:val="28"/>
+          <w:szCs w:val="28"/>
+        </w:rPr>
+        <w:t>, проверено подключение к БД</w:t>
+      </w:r>
+      <w:r>
+        <w:rPr>
+          <w:rFonts w:ascii="Times New Roman" w:hAnsi="Times New Roman" w:cs="Times New Roman"/>
+          <w:sz w:val="28"/>
+          <w:szCs w:val="28"/>
+        </w:rPr>
+        <w:t>;</w:t>
+      </w:r>
+    </w:p>
+    <w:p>
+      <w:pPr>
+        <w:pStyle w:val="a3"/>
+        <w:numPr>
+          <w:ilvl w:val="0"/>
+          <w:numId w:val="5"/>
+        </w:numPr>
+        <w:tabs>
+          <w:tab w:val="left" w:pos="993"/>
+        </w:tabs>
+        <w:spacing w:after="0" w:line="276" w:lineRule="auto"/>
+        <w:ind w:left="0" w:firstLine="709"/>
+        <w:jc w:val="both"/>
+        <w:rPr>
+          <w:rFonts w:ascii="Times New Roman" w:hAnsi="Times New Roman" w:cs="Times New Roman"/>
+          <w:sz w:val="28"/>
+          <w:szCs w:val="28"/>
+        </w:rPr>
+      </w:pPr>
+      <w:r>
+        <w:rPr>
+          <w:rFonts w:ascii="Times New Roman" w:hAnsi="Times New Roman" w:cs="Times New Roman"/>
+          <w:sz w:val="28"/>
+          <w:szCs w:val="28"/>
+        </w:rPr>
+        <w:t xml:space="preserve">Установлен </w:t>
+      </w:r>
+      <w:proofErr w:type="spellStart"/>
+      <w:r>
+        <w:rPr>
+          <w:rFonts w:ascii="Times New Roman" w:hAnsi="Times New Roman" w:cs="Times New Roman"/>
+          <w:sz w:val="28"/>
+          <w:szCs w:val="28"/>
+        </w:rPr>
+        <w:t>Python</w:t>
+      </w:r>
+      <w:proofErr w:type="spellEnd"/>
+      <w:r>
+        <w:rPr>
+          <w:rFonts w:ascii="Times New Roman" w:hAnsi="Times New Roman" w:cs="Times New Roman"/>
+          <w:sz w:val="28"/>
+          <w:szCs w:val="28"/>
+        </w:rPr>
+        <w:t xml:space="preserve">, </w:t>
+      </w:r>
+      <w:proofErr w:type="spellStart"/>
+      <w:r>
+        <w:rPr>
+          <w:rFonts w:ascii="Times New Roman" w:hAnsi="Times New Roman" w:cs="Times New Roman"/>
+          <w:sz w:val="28"/>
+          <w:szCs w:val="28"/>
+        </w:rPr>
+        <w:t>pip</w:t>
+      </w:r>
+      <w:proofErr w:type="spellEnd"/>
+      <w:r>
+        <w:rPr>
+          <w:rFonts w:ascii="Times New Roman" w:hAnsi="Times New Roman" w:cs="Times New Roman"/>
+          <w:sz w:val="28"/>
+          <w:szCs w:val="28"/>
+        </w:rPr>
+        <w:t xml:space="preserve">, </w:t>
+      </w:r>
+      <w:proofErr w:type="spellStart"/>
+      <w:r>
+        <w:rPr>
+          <w:rFonts w:ascii="Times New Roman" w:hAnsi="Times New Roman" w:cs="Times New Roman"/>
+          <w:sz w:val="28"/>
+          <w:szCs w:val="28"/>
+        </w:rPr>
+        <w:t>venv</w:t>
+      </w:r>
+      <w:proofErr w:type="spellEnd"/>
+      <w:r>
+        <w:rPr>
+          <w:rFonts w:ascii="Times New Roman" w:hAnsi="Times New Roman" w:cs="Times New Roman"/>
+          <w:sz w:val="28"/>
+          <w:szCs w:val="28"/>
+        </w:rPr>
+        <w:t xml:space="preserve">, создана виртуальная среда </w:t>
+      </w:r>
+      <w:proofErr w:type="spellStart"/>
+      <w:r>
+        <w:rPr>
+          <w:rFonts w:ascii="Times New Roman" w:hAnsi="Times New Roman" w:cs="Times New Roman"/>
+          <w:sz w:val="28"/>
+          <w:szCs w:val="28"/>
+        </w:rPr>
+        <w:t>gasenv</w:t>
+      </w:r>
+      <w:proofErr w:type="spellEnd"/>
+      <w:r>
+        <w:rPr>
+          <w:rFonts w:ascii="Times New Roman" w:hAnsi="Times New Roman" w:cs="Times New Roman"/>
+          <w:sz w:val="28"/>
+          <w:szCs w:val="28"/>
+        </w:rPr>
+        <w:t xml:space="preserve">, в которой установлен </w:t>
+      </w:r>
+      <w:proofErr w:type="spellStart"/>
+      <w:r>
+        <w:rPr>
+          <w:rFonts w:ascii="Times New Roman" w:hAnsi="Times New Roman" w:cs="Times New Roman"/>
+          <w:sz w:val="28"/>
+          <w:szCs w:val="28"/>
+        </w:rPr>
+        <w:t>Django</w:t>
+      </w:r>
+      <w:proofErr w:type="spellEnd"/>
+      <w:r>
+        <w:rPr>
+          <w:rFonts w:ascii="Times New Roman" w:hAnsi="Times New Roman" w:cs="Times New Roman"/>
+          <w:sz w:val="28"/>
+          <w:szCs w:val="28"/>
+        </w:rPr>
+        <w:t xml:space="preserve"> и необходимые библиотеки (psycopg2-binary, </w:t>
+      </w:r>
+      <w:proofErr w:type="spellStart"/>
+      <w:r>
+        <w:rPr>
+          <w:rFonts w:ascii="Times New Roman" w:hAnsi="Times New Roman" w:cs="Times New Roman"/>
+          <w:sz w:val="28"/>
+          <w:szCs w:val="28"/>
+        </w:rPr>
+        <w:t>requests</w:t>
+      </w:r>
+      <w:proofErr w:type="spellEnd"/>
+      <w:r>
+        <w:rPr>
+          <w:rFonts w:ascii="Times New Roman" w:hAnsi="Times New Roman" w:cs="Times New Roman"/>
+          <w:sz w:val="28"/>
+          <w:szCs w:val="28"/>
+        </w:rPr>
+        <w:t xml:space="preserve">). Создан </w:t>
+      </w:r>
+      <w:proofErr w:type="spellStart"/>
+      <w:r>
+        <w:rPr>
+          <w:rFonts w:ascii="Times New Roman" w:hAnsi="Times New Roman" w:cs="Times New Roman"/>
+          <w:sz w:val="28"/>
+          <w:szCs w:val="28"/>
+        </w:rPr>
+        <w:t>Django</w:t>
+      </w:r>
+      <w:proofErr w:type="spellEnd"/>
+      <w:r>
+        <w:rPr>
+          <w:rFonts w:ascii="Times New Roman" w:hAnsi="Times New Roman" w:cs="Times New Roman"/>
+          <w:sz w:val="28"/>
+          <w:szCs w:val="28"/>
+        </w:rPr>
+        <w:t xml:space="preserve">-проект </w:t>
+      </w:r>
+      <w:proofErr w:type="spellStart"/>
+      <w:r>
+        <w:rPr>
+          <w:rFonts w:ascii="Times New Roman" w:hAnsi="Times New Roman" w:cs="Times New Roman"/>
+          <w:sz w:val="28"/>
+          <w:szCs w:val="28"/>
+        </w:rPr>
+        <w:t>gasproject</w:t>
+      </w:r>
+      <w:proofErr w:type="spellEnd"/>
+      <w:r>
+        <w:rPr>
+          <w:rFonts w:ascii="Times New Roman" w:hAnsi="Times New Roman" w:cs="Times New Roman"/>
+          <w:sz w:val="28"/>
+          <w:szCs w:val="28"/>
+        </w:rPr>
+        <w:t xml:space="preserve"> и приложение </w:t>
+      </w:r>
+      <w:proofErr w:type="spellStart"/>
+      <w:r>
+        <w:rPr>
+          <w:rFonts w:ascii="Times New Roman" w:hAnsi="Times New Roman" w:cs="Times New Roman"/>
+          <w:sz w:val="28"/>
+          <w:szCs w:val="28"/>
+        </w:rPr>
+        <w:t>gasapp</w:t>
+      </w:r>
+      <w:proofErr w:type="spellEnd"/>
+      <w:r>
+        <w:rPr>
+          <w:rFonts w:ascii="Times New Roman" w:hAnsi="Times New Roman" w:cs="Times New Roman"/>
+          <w:sz w:val="28"/>
+          <w:szCs w:val="28"/>
+        </w:rPr>
+        <w:t>, реализующее учёт показаний приборов учёта газа</w:t>
+      </w:r>
+      <w:r>
+        <w:rPr>
+          <w:rFonts w:ascii="Times New Roman" w:hAnsi="Times New Roman" w:cs="Times New Roman"/>
+          <w:sz w:val="28"/>
+          <w:szCs w:val="28"/>
+        </w:rPr>
+        <w:t>;</w:t>
+      </w:r>
+    </w:p>
+    <w:p>
+      <w:pPr>
+        <w:pStyle w:val="a3"/>
+        <w:numPr>
+          <w:ilvl w:val="0"/>
+          <w:numId w:val="5"/>
+        </w:numPr>
+        <w:tabs>
+          <w:tab w:val="left" w:pos="993"/>
+        </w:tabs>
+        <w:spacing w:after="0" w:line="276" w:lineRule="auto"/>
+        <w:ind w:left="0" w:firstLine="709"/>
+        <w:jc w:val="both"/>
+        <w:rPr>
+          <w:rFonts w:ascii="Times New Roman" w:hAnsi="Times New Roman" w:cs="Times New Roman"/>
+          <w:sz w:val="28"/>
+          <w:szCs w:val="28"/>
+        </w:rPr>
+      </w:pPr>
+      <w:r>
+        <w:rPr>
+          <w:rFonts w:ascii="Times New Roman" w:hAnsi="Times New Roman" w:cs="Times New Roman"/>
+          <w:sz w:val="28"/>
+          <w:szCs w:val="28"/>
+        </w:rPr>
+        <w:t xml:space="preserve">Разработана модель </w:t>
+      </w:r>
+      <w:proofErr w:type="spellStart"/>
+      <w:r>
+        <w:rPr>
+          <w:rFonts w:ascii="Times New Roman" w:hAnsi="Times New Roman" w:cs="Times New Roman"/>
+          <w:sz w:val="28"/>
+          <w:szCs w:val="28"/>
+        </w:rPr>
+        <w:t>GasReading</w:t>
+      </w:r>
+      <w:proofErr w:type="spellEnd"/>
+      <w:r>
+        <w:rPr>
+          <w:rFonts w:ascii="Times New Roman" w:hAnsi="Times New Roman" w:cs="Times New Roman"/>
+          <w:sz w:val="28"/>
+          <w:szCs w:val="28"/>
+        </w:rPr>
+        <w:t>, выполнены миграции, созданы представления, формы и шаблоны.</w:t>
+      </w:r>
+    </w:p>
+    <w:p>
+      <w:pPr>
+        <w:pStyle w:val="a3"/>
+        <w:numPr>
+          <w:ilvl w:val="0"/>
+          <w:numId w:val="5"/>
+        </w:numPr>
+        <w:tabs>
+          <w:tab w:val="left" w:pos="993"/>
+        </w:tabs>
+        <w:spacing w:after="0" w:line="276" w:lineRule="auto"/>
+        <w:ind w:left="0" w:firstLine="709"/>
+        <w:jc w:val="both"/>
+        <w:rPr>
+          <w:rFonts w:ascii="Times New Roman" w:hAnsi="Times New Roman" w:cs="Times New Roman"/>
+          <w:sz w:val="28"/>
+          <w:szCs w:val="28"/>
+        </w:rPr>
+      </w:pPr>
+      <w:r>
+        <w:rPr>
+          <w:rFonts w:ascii="Times New Roman" w:hAnsi="Times New Roman" w:cs="Times New Roman"/>
+          <w:sz w:val="28"/>
+          <w:szCs w:val="28"/>
+        </w:rPr>
+        <w:t xml:space="preserve">Проект размещён в репозитории на </w:t>
+      </w:r>
+      <w:proofErr w:type="spellStart"/>
+      <w:r>
+        <w:rPr>
+          <w:rFonts w:ascii="Times New Roman" w:hAnsi="Times New Roman" w:cs="Times New Roman"/>
+          <w:sz w:val="28"/>
+          <w:szCs w:val="28"/>
+        </w:rPr>
+        <w:t>GitHub</w:t>
+      </w:r>
+      <w:proofErr w:type="spellEnd"/>
+      <w:r>
+        <w:rPr>
+          <w:rFonts w:ascii="Times New Roman" w:hAnsi="Times New Roman" w:cs="Times New Roman"/>
+          <w:sz w:val="28"/>
+          <w:szCs w:val="28"/>
+        </w:rPr>
+        <w:t xml:space="preserve">, работа с </w:t>
+      </w:r>
+      <w:proofErr w:type="spellStart"/>
+      <w:r>
+        <w:rPr>
+          <w:rFonts w:ascii="Times New Roman" w:hAnsi="Times New Roman" w:cs="Times New Roman"/>
+          <w:sz w:val="28"/>
+          <w:szCs w:val="28"/>
+        </w:rPr>
+        <w:t>Git</w:t>
+      </w:r>
+      <w:proofErr w:type="spellEnd"/>
+      <w:r>
+        <w:rPr>
+          <w:rFonts w:ascii="Times New Roman" w:hAnsi="Times New Roman" w:cs="Times New Roman"/>
+          <w:sz w:val="28"/>
+          <w:szCs w:val="28"/>
+        </w:rPr>
+        <w:t xml:space="preserve"> велась напрямую из виртуальной машины </w:t>
+      </w:r>
+      <w:proofErr w:type="spellStart"/>
+      <w:r>
+        <w:rPr>
+          <w:rFonts w:ascii="Times New Roman" w:hAnsi="Times New Roman" w:cs="Times New Roman"/>
+          <w:sz w:val="28"/>
+          <w:szCs w:val="28"/>
+        </w:rPr>
+        <w:t>Debian</w:t>
+      </w:r>
+      <w:proofErr w:type="spellEnd"/>
+      <w:r>
+        <w:rPr>
+          <w:rFonts w:ascii="Times New Roman" w:hAnsi="Times New Roman" w:cs="Times New Roman"/>
+          <w:sz w:val="28"/>
+          <w:szCs w:val="28"/>
+        </w:rPr>
+        <w:t xml:space="preserve"> по SSH.</w:t>
+      </w:r>
+    </w:p>
+    <w:p>
+      <w:pPr>
+        <w:spacing w:after="0" w:line="276" w:lineRule="auto"/>
+        <w:ind w:firstLine="709"/>
+        <w:jc w:val="both"/>
+        <w:rPr>
+          <w:rFonts w:ascii="Times New Roman" w:hAnsi="Times New Roman" w:cs="Times New Roman"/>
+          <w:sz w:val="28"/>
+          <w:szCs w:val="28"/>
+        </w:rPr>
+      </w:pPr>
+      <w:bookmarkStart w:id="0" w:name="_GoBack"/>
+      <w:bookmarkEnd w:id="0"/>
     </w:p>
     <w:p>
       <w:pPr>
@@ -5104,8 +5620,6 @@
         </w:r>
         <w:proofErr w:type="spellEnd"/>
       </w:hyperlink>
-      <w:bookmarkStart w:id="0" w:name="_GoBack"/>
-      <w:bookmarkEnd w:id="0"/>
     </w:p>
     <w:sectPr>
       <w:pgSz w:w="11906" w:h="16838"/>
@@ -5298,6 +5812,119 @@
     </w:lvl>
   </w:abstractNum>
   <w:abstractNum w:abstractNumId="2" w15:restartNumberingAfterBreak="0">
+    <w:nsid w:val="19336B9F"/>
+    <w:multiLevelType w:val="hybridMultilevel"/>
+    <w:tmpl w:val="274E5A42"/>
+    <w:lvl w:ilvl="0" w:tplc="04190001">
+      <w:start w:val="1"/>
+      <w:numFmt w:val="bullet"/>
+      <w:lvlText w:val=""/>
+      <w:lvlJc w:val="left"/>
+      <w:pPr>
+        <w:ind w:left="1429" w:hanging="360"/>
+      </w:pPr>
+      <w:rPr>
+        <w:rFonts w:ascii="Symbol" w:hAnsi="Symbol" w:hint="default"/>
+      </w:rPr>
+    </w:lvl>
+    <w:lvl w:ilvl="1" w:tplc="04190003" w:tentative="1">
+      <w:start w:val="1"/>
+      <w:numFmt w:val="bullet"/>
+      <w:lvlText w:val="o"/>
+      <w:lvlJc w:val="left"/>
+      <w:pPr>
+        <w:ind w:left="2149" w:hanging="360"/>
+      </w:pPr>
+      <w:rPr>
+        <w:rFonts w:ascii="Courier New" w:hAnsi="Courier New" w:cs="Courier New" w:hint="default"/>
+      </w:rPr>
+    </w:lvl>
+    <w:lvl w:ilvl="2" w:tplc="04190005" w:tentative="1">
+      <w:start w:val="1"/>
+      <w:numFmt w:val="bullet"/>
+      <w:lvlText w:val=""/>
+      <w:lvlJc w:val="left"/>
+      <w:pPr>
+        <w:ind w:left="2869" w:hanging="360"/>
+      </w:pPr>
+      <w:rPr>
+        <w:rFonts w:ascii="Wingdings" w:hAnsi="Wingdings" w:hint="default"/>
+      </w:rPr>
+    </w:lvl>
+    <w:lvl w:ilvl="3" w:tplc="04190001" w:tentative="1">
+      <w:start w:val="1"/>
+      <w:numFmt w:val="bullet"/>
+      <w:lvlText w:val=""/>
+      <w:lvlJc w:val="left"/>
+      <w:pPr>
+        <w:ind w:left="3589" w:hanging="360"/>
+      </w:pPr>
+      <w:rPr>
+        <w:rFonts w:ascii="Symbol" w:hAnsi="Symbol" w:hint="default"/>
+      </w:rPr>
+    </w:lvl>
+    <w:lvl w:ilvl="4" w:tplc="04190003" w:tentative="1">
+      <w:start w:val="1"/>
+      <w:numFmt w:val="bullet"/>
+      <w:lvlText w:val="o"/>
+      <w:lvlJc w:val="left"/>
+      <w:pPr>
+        <w:ind w:left="4309" w:hanging="360"/>
+      </w:pPr>
+      <w:rPr>
+        <w:rFonts w:ascii="Courier New" w:hAnsi="Courier New" w:cs="Courier New" w:hint="default"/>
+      </w:rPr>
+    </w:lvl>
+    <w:lvl w:ilvl="5" w:tplc="04190005" w:tentative="1">
+      <w:start w:val="1"/>
+      <w:numFmt w:val="bullet"/>
+      <w:lvlText w:val=""/>
+      <w:lvlJc w:val="left"/>
+      <w:pPr>
+        <w:ind w:left="5029" w:hanging="360"/>
+      </w:pPr>
+      <w:rPr>
+        <w:rFonts w:ascii="Wingdings" w:hAnsi="Wingdings" w:hint="default"/>
+      </w:rPr>
+    </w:lvl>
+    <w:lvl w:ilvl="6" w:tplc="04190001" w:tentative="1">
+      <w:start w:val="1"/>
+      <w:numFmt w:val="bullet"/>
+      <w:lvlText w:val=""/>
+      <w:lvlJc w:val="left"/>
+      <w:pPr>
+        <w:ind w:left="5749" w:hanging="360"/>
+      </w:pPr>
+      <w:rPr>
+        <w:rFonts w:ascii="Symbol" w:hAnsi="Symbol" w:hint="default"/>
+      </w:rPr>
+    </w:lvl>
+    <w:lvl w:ilvl="7" w:tplc="04190003" w:tentative="1">
+      <w:start w:val="1"/>
+      <w:numFmt w:val="bullet"/>
+      <w:lvlText w:val="o"/>
+      <w:lvlJc w:val="left"/>
+      <w:pPr>
+        <w:ind w:left="6469" w:hanging="360"/>
+      </w:pPr>
+      <w:rPr>
+        <w:rFonts w:ascii="Courier New" w:hAnsi="Courier New" w:cs="Courier New" w:hint="default"/>
+      </w:rPr>
+    </w:lvl>
+    <w:lvl w:ilvl="8" w:tplc="04190005" w:tentative="1">
+      <w:start w:val="1"/>
+      <w:numFmt w:val="bullet"/>
+      <w:lvlText w:val=""/>
+      <w:lvlJc w:val="left"/>
+      <w:pPr>
+        <w:ind w:left="7189" w:hanging="360"/>
+      </w:pPr>
+      <w:rPr>
+        <w:rFonts w:ascii="Wingdings" w:hAnsi="Wingdings" w:hint="default"/>
+      </w:rPr>
+    </w:lvl>
+  </w:abstractNum>
+  <w:abstractNum w:abstractNumId="3" w15:restartNumberingAfterBreak="0">
     <w:nsid w:val="4A8224D3"/>
     <w:multiLevelType w:val="hybridMultilevel"/>
     <w:tmpl w:val="CD26BEFE"/>
@@ -5386,7 +6013,7 @@
       </w:pPr>
     </w:lvl>
   </w:abstractNum>
-  <w:abstractNum w:abstractNumId="3" w15:restartNumberingAfterBreak="0">
+  <w:abstractNum w:abstractNumId="4" w15:restartNumberingAfterBreak="0">
     <w:nsid w:val="7A322038"/>
     <w:multiLevelType w:val="hybridMultilevel"/>
     <w:tmpl w:val="A44EDEA6"/>
@@ -5482,9 +6109,12 @@
     <w:abstractNumId w:val="0"/>
   </w:num>
   <w:num w:numId="3">
+    <w:abstractNumId w:val="4"/>
+  </w:num>
+  <w:num w:numId="4">
     <w:abstractNumId w:val="3"/>
   </w:num>
-  <w:num w:numId="4">
+  <w:num w:numId="5">
     <w:abstractNumId w:val="2"/>
   </w:num>
 </w:numbering>
@@ -6009,6 +6639,33 @@
       <w:u w:val="single"/>
     </w:rPr>
   </w:style>
+  <w:style w:type="paragraph" w:customStyle="1" w:styleId="ds-markdown-paragraph">
+    <w:name w:val="ds-markdown-paragraph"/>
+    <w:basedOn w:val="a"/>
+    <w:rsid w:val="006F32E4"/>
+    <w:pPr>
+      <w:spacing w:before="100" w:beforeAutospacing="1" w:after="100" w:afterAutospacing="1" w:line="240" w:lineRule="auto"/>
+    </w:pPr>
+    <w:rPr>
+      <w:rFonts w:ascii="Times New Roman" w:eastAsia="Times New Roman" w:hAnsi="Times New Roman" w:cs="Times New Roman"/>
+      <w:sz w:val="24"/>
+      <w:szCs w:val="24"/>
+      <w:lang w:eastAsia="ru-RU"/>
+    </w:rPr>
+  </w:style>
+  <w:style w:type="character" w:styleId="HTML1">
+    <w:name w:val="HTML Code"/>
+    <w:basedOn w:val="a0"/>
+    <w:uiPriority w:val="99"/>
+    <w:semiHidden/>
+    <w:unhideWhenUsed/>
+    <w:rsid w:val="006F32E4"/>
+    <w:rPr>
+      <w:rFonts w:ascii="Courier New" w:eastAsia="Times New Roman" w:hAnsi="Courier New" w:cs="Courier New"/>
+      <w:sz w:val="20"/>
+      <w:szCs w:val="20"/>
+    </w:rPr>
+  </w:style>
 </w:styles>
 </file>
 
@@ -6312,7 +6969,7 @@
 </file>
 
 <file path=customXml/itemProps1.xml><?xml version="1.0" encoding="utf-8"?>
-<ds:datastoreItem xmlns:ds="http://schemas.openxmlformats.org/officeDocument/2006/customXml" ds:itemID="{F56F632C-F0DC-4BEA-8746-C4D48E4D2DED}">
+<ds:datastoreItem xmlns:ds="http://schemas.openxmlformats.org/officeDocument/2006/customXml" ds:itemID="{9BC4706B-B524-4EBF-BB56-A318BBF11740}">
   <ds:schemaRefs>
     <ds:schemaRef ds:uri="http://schemas.openxmlformats.org/officeDocument/2006/bibliography"/>
   </ds:schemaRefs>

</xml_diff>